<commit_message>
Hinweis docx: fix affiliation font, abbreviations, long author lists, top whitespace
Co-Authored-By: Claude Sonnet 5.5 <noreply@anthropic.com>
</commit_message>
<xml_diff>
--- a/paper/hinweis/AIDE2026_paper.docx
+++ b/paper/hinweis/AIDE2026_paper.docx
@@ -2,81 +2,10 @@
 <file path=word/document.xml><?xml version="1.0" encoding="utf-8"?>
 <w:document xmlns:ve="http://schemas.openxmlformats.org/markup-compatibility/2006" xmlns:o="urn:schemas-microsoft-com:office:office" xmlns:r="http://schemas.openxmlformats.org/officeDocument/2006/relationships" xmlns:m="http://schemas.openxmlformats.org/officeDocument/2006/math" xmlns:v="urn:schemas-microsoft-com:vml" xmlns:wp="http://schemas.openxmlformats.org/drawingml/2006/wordprocessingDrawing" xmlns:w10="urn:schemas-microsoft-com:office:word" xmlns:w="http://schemas.openxmlformats.org/wordprocessingml/2006/main" xmlns:wne="http://schemas.microsoft.com/office/word/2006/wordml">
   <w:body>
-    <w:tbl>
-      <w:tblPr>
-        <w:tblpPr w:leftFromText="180" w:rightFromText="180" w:vertAnchor="text" w:horzAnchor="margin" w:tblpY="1065"/>
-        <w:tblW w:w="5000" w:type="pct"/>
-        <w:tblLook w:val="04A0"/>
-      </w:tblPr>
-      <w:tblGrid>
-        <w:gridCol w:w="2489"/>
-        <w:gridCol w:w="6515"/>
-      </w:tblGrid>
-      <w:tr>
-        <w:trPr>
-          <w:trHeight w:val="291"/>
-        </w:trPr>
-        <w:tc>
-          <w:tcPr>
-            <w:tcW w:w="1382" w:type="pct"/>
-          </w:tcPr>
-          <w:p>
-            <w:pPr>
-              <w:pStyle w:val="icsmtitle"/>
-              <w:spacing w:before="0" w:after="0"/>
-              <w:jc w:val="left"/>
-            </w:pPr>
-          </w:p>
-        </w:tc>
-        <w:tc>
-          <w:tcPr>
-            <w:tcW w:w="3618" w:type="pct"/>
-          </w:tcPr>
-          <w:p>
-            <w:pPr>
-              <w:pStyle w:val="Header"/>
-              <w:jc w:val="right"/>
-              <w:rPr>
-                <w:i/>
-                <w:sz w:val="18"/>
-                <w:szCs w:val="18"/>
-              </w:rPr>
-            </w:pPr>
-          </w:p>
-        </w:tc>
-      </w:tr>
-    </w:tbl>
     <w:p>
       <w:pPr>
         <w:pStyle w:val="StylepapertitleAsianMSMincho"/>
         <w:spacing w:before="0" w:after="0"/>
-      </w:pPr>
-    </w:p>
-    <w:p>
-      <w:pPr>
-        <w:rPr>
-          <w:lang w:val="en-US"/>
-        </w:rPr>
-      </w:pPr>
-    </w:p>
-    <w:p>
-      <w:pPr>
-        <w:jc w:val="center"/>
-        <w:rPr>
-          <w:lang w:val="en-US"/>
-        </w:rPr>
-      </w:pPr>
-    </w:p>
-    <w:p>
-      <w:pPr>
-        <w:pStyle w:val="StylepapertitleAsianMSMincho"/>
-        <w:spacing w:before="0" w:after="0"/>
-      </w:pPr>
-    </w:p>
-    <w:p>
-      <w:pPr>
-        <w:pStyle w:val="StylepapertitleAsianMSMincho"/>
-        <w:spacing w:before="0" w:after="0"/>
         <w:rPr>
           <w:sz w:val="40"/>
           <w:szCs w:val="40"/>
@@ -92,16 +21,6 @@
     </w:p>
     <w:p>
       <w:pPr>
-        <w:pStyle w:val="StylepapertitleAsianMSMincho"/>
-        <w:spacing w:before="0" w:after="0"/>
-        <w:rPr>
-          <w:sz w:val="40"/>
-          <w:szCs w:val="40"/>
-        </w:rPr>
-      </w:pPr>
-    </w:p>
-    <w:p>
-      <w:pPr>
         <w:pStyle w:val="StyleAuthorAsianMSMincho"/>
         <w:rPr>
           <w:sz w:val="20"/>
@@ -124,9 +43,9 @@
       </w:pPr>
       <w:r>
         <w:rPr>
+          <w:rFonts w:ascii="Times New Roman" w:hAnsi="Times New Roman"/>
           <w:sz w:val="18"/>
           <w:szCs w:val="18"/>
-          <w:vertAlign w:val="superscript"/>
         </w:rPr>
         <w:t>NMIMS University, India</w:t>
       </w:r>
@@ -142,7 +61,7 @@
       </w:pPr>
       <w:r>
         <w:rPr>
-          <w:rFonts w:eastAsia="MS Mincho"/>
+          <w:rFonts w:eastAsia="MS Mincho" w:ascii="Times New Roman" w:hAnsi="Times New Roman"/>
           <w:sz w:val="18"/>
           <w:szCs w:val="18"/>
         </w:rPr>
@@ -200,7 +119,7 @@
         <w:rPr>
           <w:szCs w:val="18"/>
         </w:rPr>
-        <w:t>—Silicon sampling asks a language model to answer a survey as if it were a respondent with a given demographic profile, which would be far cheaper than fielding a questionnaire. We ask what the profile actually contributes and what fine-tuning changes, using Pew Research Center's Religion in India survey (N = 29,999) and WVS-7 India (N = 1,692), with every method scored on the same respondent-item rows as matched classifiers. On a 200-respondent Pew subset, zero-shot Qwen2.5-7B-Instruct gets 17.5% right, against 30.2% for always giving the most common answer. It reacts strongly to the profile (the profile explains 29% of its prediction variance, against 4% for real answers), but its group differences correlate only r = 0.22 with the real ones, and removing the profile raises accuracy by 3.6 points. After QLoRA fine-tuning on 184,853 respondent-level examples, the model reaches 38.0% on all 6,000 held-out respondents (majority 30.4%, logistic regression 38.5%, gradient boosting 40.0%) and is well calibrated (ECE 0.009). The gain did not carry over to new questions in our test: an approximate port of the adapter scores 28.9% on eight unseen items against 28.5% for its base model. The in-domain gain is 13.7 points larger over respondents, but with eight items per side that difference cannot be told apart from zero. A 120B zero-shot model scores 27.6% on 100 respondents, below the 30.0% majority class (not significant). Logistic regression needs about 400 labelled respondents, and gradient boosting about 1,600, to clear the majority class. On WVS-7 India, three zero-shot LLMs score 22 to 26% on 15 items where the majority class scores 21 to 25%, and their group differences carry no directional signal.</w:t>
+        <w:t>—Silicon sampling asks a language model to answer a survey as if it were a respondent with a given demographic profile, which would be far cheaper than fielding a questionnaire. We ask what the profile actually contributes and what fine-tuning changes, using Pew Research Center's Religion in India survey (N = 29,999) and the World Values Survey wave 7 (WVS-7) for India (N = 1,692), with every method scored on the same respondent-item rows as matched classifiers. On a 200-respondent Pew subset, zero-shot Qwen2.5-7B-Instruct gets 17.5% right, against 30.2% for always giving the most common answer. It reacts strongly to the profile (the profile explains 29% of its prediction variance, against 4% for real answers), but its group differences correlate only r = 0.22 with the real ones, and removing the profile raises accuracy by 3.6 points. After fine-tuning with QLoRA (quantised low-rank adaptation) on 184,853 respondent-level examples, the model reaches 38.0% on all 6,000 held-out respondents (majority 30.4%, logistic regression 38.5%, gradient boosting 40.0%) and is well calibrated (expected calibration error 0.009). The gain did not carry over to new questions in our test: an approximate port of the adapter scores 28.9% on eight unseen items against 28.5% for its base model. The in-domain gain is 13.7 points larger over respondents, but with eight items per side that difference cannot be told apart from zero. A 120B zero-shot model scores 27.6% on 100 respondents, below the 30.0% majority class (not significant). Logistic regression needs about 400 labelled respondents, and gradient boosting about 1,600, to clear the majority class. On WVS-7 India, three zero-shot large language models (LLMs) score 22 to 26% on 15 items where the majority class scores 21 to 25%, and their group differences carry no directional signal.</w:t>
       </w:r>
     </w:p>
     <w:p>
@@ -392,7 +311,7 @@
           <w:smallCaps w:val="0"/>
           <w:sz w:val="18"/>
         </w:rPr>
-        <w:t xml:space="preserve"> Random forests perform comparably to LLMs at the individual level on ANES, with LLMs matching aggregates better [4]. Across GSS and the 63-country WVS, no model beats the strongest baseline, models over-determine attitudes by demographics, and segment gaps are inflated two- to fourfold [3]. Recent reports find negligible individual-level recovery on the European Social Survey [9] and in Singapore [10], and demographic information that is readable inside a 7B model but barely used [11]. Fine-tuning on survey data generalises to unseen subpopulations and surveys [12], partly to unseen questions and countries [13], and helps with small pilot samples [14]; rectification can be worth more than fine-tuning when human data are scarce [15], and respondent embeddings can be trained over a frozen model [16]. We take the baseline and over-determination findings as established. What we add is an India study with respondent-level fine-tuning and a same-model zero-shot control, diagnostics that separate how much the profile is used from whether it is used in the right direction, and a held-out-item test.</w:t>
+        <w:t xml:space="preserve"> Random forests perform comparably to LLMs at the individual level on the American National Election Studies, with LLMs matching aggregates better [4]. Across the General Social Survey and the 63-country WVS, no model beats the strongest baseline, models over-determine attitudes by demographics, and segment gaps are inflated two- to fourfold [3]. Recent reports find negligible individual-level recovery on the European Social Survey [9] and in Singapore [10], and demographic information that is readable inside a 7B model but barely used [11]. Fine-tuning on survey data generalises to unseen subpopulations and surveys [12], partly to unseen questions and countries [13], and helps with small pilot samples [14]; rectification can be worth more than fine-tuning when human data are scarce [15], and respondent embeddings can be trained over a frozen model [16]. We take the baseline and over-determination findings as established. What we add is an India study with respondent-level fine-tuning and a same-model zero-shot control, diagnostics that separate how much the profile is used from whether it is used in the right direction, and a held-out-item test.</w:t>
       </w:r>
     </w:p>
     <w:p>
@@ -5733,7 +5652,7 @@
       <w:tr>
         <w:tc>
           <w:tcPr>
-            <w:tcW w:type="dxa" w:w="2381"/>
+            <w:tcW w:type="dxa" w:w="2154"/>
             <w:tcBorders>
               <w:top w:val="single" w:sz="12" w:space="0" w:color="000000"/>
               <w:bottom w:val="single" w:sz="12" w:space="0" w:color="000000"/>
@@ -5756,7 +5675,7 @@
         </w:tc>
         <w:tc>
           <w:tcPr>
-            <w:tcW w:type="dxa" w:w="2211"/>
+            <w:tcW w:type="dxa" w:w="2154"/>
             <w:tcBorders>
               <w:top w:val="single" w:sz="12" w:space="0" w:color="000000"/>
               <w:bottom w:val="single" w:sz="12" w:space="0" w:color="000000"/>
@@ -5779,7 +5698,7 @@
         </w:tc>
         <w:tc>
           <w:tcPr>
-            <w:tcW w:type="dxa" w:w="2211"/>
+            <w:tcW w:type="dxa" w:w="2154"/>
             <w:tcBorders>
               <w:top w:val="single" w:sz="12" w:space="0" w:color="000000"/>
               <w:bottom w:val="single" w:sz="12" w:space="0" w:color="000000"/>
@@ -5802,7 +5721,7 @@
         </w:tc>
         <w:tc>
           <w:tcPr>
-            <w:tcW w:type="dxa" w:w="2211"/>
+            <w:tcW w:type="dxa" w:w="2154"/>
             <w:tcBorders>
               <w:top w:val="single" w:sz="12" w:space="0" w:color="000000"/>
               <w:bottom w:val="single" w:sz="12" w:space="0" w:color="000000"/>
@@ -5827,7 +5746,7 @@
       <w:tr>
         <w:tc>
           <w:tcPr>
-            <w:tcW w:type="dxa" w:w="2381"/>
+            <w:tcW w:type="dxa" w:w="2154"/>
             <w:tcBorders/>
           </w:tcPr>
           <w:p>
@@ -5847,7 +5766,7 @@
         </w:tc>
         <w:tc>
           <w:tcPr>
-            <w:tcW w:type="dxa" w:w="2211"/>
+            <w:tcW w:type="dxa" w:w="2154"/>
             <w:tcBorders/>
           </w:tcPr>
           <w:p>
@@ -5867,7 +5786,7 @@
         </w:tc>
         <w:tc>
           <w:tcPr>
-            <w:tcW w:type="dxa" w:w="2211"/>
+            <w:tcW w:type="dxa" w:w="2154"/>
             <w:tcBorders/>
           </w:tcPr>
           <w:p>
@@ -5887,7 +5806,7 @@
         </w:tc>
         <w:tc>
           <w:tcPr>
-            <w:tcW w:type="dxa" w:w="2211"/>
+            <w:tcW w:type="dxa" w:w="2154"/>
             <w:tcBorders/>
           </w:tcPr>
           <w:p>
@@ -5909,7 +5828,7 @@
       <w:tr>
         <w:tc>
           <w:tcPr>
-            <w:tcW w:type="dxa" w:w="2381"/>
+            <w:tcW w:type="dxa" w:w="2154"/>
             <w:tcBorders/>
           </w:tcPr>
           <w:p>
@@ -5929,7 +5848,7 @@
         </w:tc>
         <w:tc>
           <w:tcPr>
-            <w:tcW w:type="dxa" w:w="2211"/>
+            <w:tcW w:type="dxa" w:w="2154"/>
             <w:tcBorders/>
           </w:tcPr>
           <w:p>
@@ -5949,7 +5868,7 @@
         </w:tc>
         <w:tc>
           <w:tcPr>
-            <w:tcW w:type="dxa" w:w="2211"/>
+            <w:tcW w:type="dxa" w:w="2154"/>
             <w:tcBorders/>
           </w:tcPr>
           <w:p>
@@ -5969,7 +5888,7 @@
         </w:tc>
         <w:tc>
           <w:tcPr>
-            <w:tcW w:type="dxa" w:w="2211"/>
+            <w:tcW w:type="dxa" w:w="2154"/>
             <w:tcBorders/>
           </w:tcPr>
           <w:p>
@@ -5991,7 +5910,7 @@
       <w:tr>
         <w:tc>
           <w:tcPr>
-            <w:tcW w:type="dxa" w:w="2381"/>
+            <w:tcW w:type="dxa" w:w="2154"/>
             <w:tcBorders/>
           </w:tcPr>
           <w:p>
@@ -6011,7 +5930,7 @@
         </w:tc>
         <w:tc>
           <w:tcPr>
-            <w:tcW w:type="dxa" w:w="2211"/>
+            <w:tcW w:type="dxa" w:w="2154"/>
             <w:tcBorders/>
           </w:tcPr>
           <w:p>
@@ -6031,7 +5950,7 @@
         </w:tc>
         <w:tc>
           <w:tcPr>
-            <w:tcW w:type="dxa" w:w="2211"/>
+            <w:tcW w:type="dxa" w:w="2154"/>
             <w:tcBorders/>
           </w:tcPr>
           <w:p>
@@ -6051,7 +5970,7 @@
         </w:tc>
         <w:tc>
           <w:tcPr>
-            <w:tcW w:type="dxa" w:w="2211"/>
+            <w:tcW w:type="dxa" w:w="2154"/>
             <w:tcBorders/>
           </w:tcPr>
           <w:p>
@@ -6073,7 +5992,7 @@
       <w:tr>
         <w:tc>
           <w:tcPr>
-            <w:tcW w:type="dxa" w:w="2381"/>
+            <w:tcW w:type="dxa" w:w="2154"/>
             <w:tcBorders/>
           </w:tcPr>
           <w:p>
@@ -6093,7 +6012,7 @@
         </w:tc>
         <w:tc>
           <w:tcPr>
-            <w:tcW w:type="dxa" w:w="2211"/>
+            <w:tcW w:type="dxa" w:w="2154"/>
             <w:tcBorders/>
           </w:tcPr>
           <w:p>
@@ -6113,7 +6032,7 @@
         </w:tc>
         <w:tc>
           <w:tcPr>
-            <w:tcW w:type="dxa" w:w="2211"/>
+            <w:tcW w:type="dxa" w:w="2154"/>
             <w:tcBorders/>
           </w:tcPr>
           <w:p>
@@ -6133,7 +6052,7 @@
         </w:tc>
         <w:tc>
           <w:tcPr>
-            <w:tcW w:type="dxa" w:w="2211"/>
+            <w:tcW w:type="dxa" w:w="2154"/>
             <w:tcBorders/>
           </w:tcPr>
           <w:p>
@@ -6155,7 +6074,7 @@
       <w:tr>
         <w:tc>
           <w:tcPr>
-            <w:tcW w:type="dxa" w:w="2381"/>
+            <w:tcW w:type="dxa" w:w="2154"/>
             <w:tcBorders/>
           </w:tcPr>
           <w:p>
@@ -6175,7 +6094,7 @@
         </w:tc>
         <w:tc>
           <w:tcPr>
-            <w:tcW w:type="dxa" w:w="2211"/>
+            <w:tcW w:type="dxa" w:w="2154"/>
             <w:tcBorders/>
           </w:tcPr>
           <w:p>
@@ -6195,7 +6114,7 @@
         </w:tc>
         <w:tc>
           <w:tcPr>
-            <w:tcW w:type="dxa" w:w="2211"/>
+            <w:tcW w:type="dxa" w:w="2154"/>
             <w:tcBorders/>
           </w:tcPr>
           <w:p>
@@ -6215,7 +6134,7 @@
         </w:tc>
         <w:tc>
           <w:tcPr>
-            <w:tcW w:type="dxa" w:w="2211"/>
+            <w:tcW w:type="dxa" w:w="2154"/>
             <w:tcBorders/>
           </w:tcPr>
           <w:p>
@@ -6237,7 +6156,7 @@
       <w:tr>
         <w:tc>
           <w:tcPr>
-            <w:tcW w:type="dxa" w:w="2381"/>
+            <w:tcW w:type="dxa" w:w="2154"/>
             <w:tcBorders>
               <w:bottom w:val="single" w:sz="12" w:space="0" w:color="000000"/>
             </w:tcBorders>
@@ -6259,7 +6178,7 @@
         </w:tc>
         <w:tc>
           <w:tcPr>
-            <w:tcW w:type="dxa" w:w="2211"/>
+            <w:tcW w:type="dxa" w:w="2154"/>
             <w:tcBorders>
               <w:bottom w:val="single" w:sz="12" w:space="0" w:color="000000"/>
             </w:tcBorders>
@@ -6281,7 +6200,7 @@
         </w:tc>
         <w:tc>
           <w:tcPr>
-            <w:tcW w:type="dxa" w:w="2211"/>
+            <w:tcW w:type="dxa" w:w="2154"/>
             <w:tcBorders>
               <w:bottom w:val="single" w:sz="12" w:space="0" w:color="000000"/>
             </w:tcBorders>
@@ -6303,7 +6222,7 @@
         </w:tc>
         <w:tc>
           <w:tcPr>
-            <w:tcW w:type="dxa" w:w="2211"/>
+            <w:tcW w:type="dxa" w:w="2154"/>
             <w:tcBorders>
               <w:bottom w:val="single" w:sz="12" w:space="0" w:color="000000"/>
             </w:tcBorders>
@@ -6600,7 +6519,7 @@
           <w:rFonts w:ascii="Times New Roman" w:hAnsi="Times New Roman"/>
           <w:sz w:val="18"/>
         </w:rPr>
-        <w:t>L. P. Argyle, E. C. Busby, N. Fulda, J. R. Gubler, C. Rytting, and D. Wingate, “Out of one, many: Using language models to simulate human samples,” Political Analysis, vol. 31, no. 3, pp. 337–351, 2023.</w:t>
+        <w:t>L. P. Argyle et al., “Out of one, many: Using language models to simulate human samples,” Political Analysis, vol. 31, no. 3, pp. 337–351, 2023.</w:t>
       </w:r>
     </w:p>
     <w:p>
@@ -6684,7 +6603,7 @@
           <w:rFonts w:ascii="Times New Roman" w:hAnsi="Times New Roman"/>
           <w:sz w:val="18"/>
         </w:rPr>
-        <w:t>H. Shankar, V. S. P., S. Margapuri, D. Mazumder, P. Kumaraguru, and A. Chakraborty, “Mind the gap: Pitfalls of LLM alignment with Asian public opinion,” in Proc. Int. AAAI Conf. Web and Social Media (ICWSM), 2026, arXiv:2603.06264.</w:t>
+        <w:t>H. Shankar et al., “Mind the gap: Pitfalls of LLM alignment with Asian public opinion,” in Proc. Int. AAAI Conf. Web and Social Media (ICWSM), 2026, arXiv:2603.06264.</w:t>
       </w:r>
     </w:p>
     <w:p>
@@ -6744,7 +6663,7 @@
           <w:rFonts w:ascii="Times New Roman" w:hAnsi="Times New Roman"/>
           <w:sz w:val="18"/>
         </w:rPr>
-        <w:t>Y. Cao, H. Liu, A. Arora, I. Augenstein, P. Röttger, and D. Hershcovich, “Specializing large language models to simulate survey response distributions for global populations,” in Proc. NAACL, 2025.</w:t>
+        <w:t>Y. Cao et al., “Specializing large language models to simulate survey response distributions for global populations,” in Proc. NAACL, 2025.</w:t>
       </w:r>
     </w:p>
     <w:p>
@@ -6804,7 +6723,7 @@
           <w:rFonts w:ascii="Times New Roman" w:hAnsi="Times New Roman"/>
           <w:sz w:val="18"/>
         </w:rPr>
-        <w:t>C. Haerpfer, R. Inglehart, A. Moreno, C. Welzel, K. Kizilova, J. Diez-Medrano, M. Lagos, P. Norris, E. Ponarin, and B. Puranen (eds.), World Values Survey: Round Seven, Country-Pooled Datafile Version 6.0.0. Madrid, Spain and Vienna, Austria: JD Systems Institute &amp; WVSA Secretariat, 2024, doi:10.14281/18241.24.</w:t>
+        <w:t>C. Haerpfer et al. (eds.), World Values Survey: Round Seven, Country-Pooled Datafile Version 6.0.0. Madrid, Spain and Vienna, Austria: JD Systems Institute &amp; WVSA Secretariat, 2024, doi:10.14281/18241.24.</w:t>
       </w:r>
     </w:p>
     <w:p>

</xml_diff>